<commit_message>
118 - review fixes: a venue's page limit is checked against the page the main text ends on, a fitting's text after the empty supplement's placeholder is kept, a fitted paper that compiles to less is set aside and the unfitted compilation kept, a writer role or session that cannot be set up records the fitting not run, a work the order dropped stays dropped when the last retry finds it, captions' tags are marked like the text's, a failed last retry still compiles, the conductor beats between tools, tables read from T<n>.md
Co-Authored-By: Claude Opus 5.5 (1M context) <noreply@anthropic.com>
</commit_message>
<xml_diff>
--- a/fixtures/compilations/recorded/nature/pandoc/paper.docx/files/paper.docx
+++ b/fixtures/compilations/recorded/nature/pandoc/paper.docx/files/paper.docx
@@ -382,7 +382,7 @@
           <wp:inline>
             <wp:extent cx="101600" cy="76200"/>
             <wp:effectExtent b="0" l="0" r="0" t="0"/>
-            <wp:docPr descr="Figure 1: The error of the fit grows with the noise." title="" id="14" name="Picture"/>
+            <wp:docPr descr="Figure 1: The error of the fit grows with the noise4." title="" id="14" name="Picture"/>
             <a:graphic>
               <a:graphicData uri="http://schemas.openxmlformats.org/drawingml/2006/picture">
                 <pic:pic>
@@ -425,7 +425,19 @@
         <w:pStyle w:val="ImageCaption"/>
       </w:pPr>
       <w:r>
-        <w:t xml:space="preserve">Figure 1: The error of the fit grows with the noise.</w:t>
+        <w:t xml:space="preserve">Figure 1: The error of the fit grows with the noise</w:t>
+      </w:r>
+      <w:hyperlink w:anchor="ref-lee-2018-noise">
+        <w:r>
+          <w:rPr>
+            <w:rStyle w:val="Hyperlink"/>
+            <w:vertAlign w:val="superscript"/>
+          </w:rPr>
+          <w:t xml:space="preserve">4</w:t>
+        </w:r>
+      </w:hyperlink>
+      <w:r>
+        <w:t xml:space="preserve">.</w:t>
       </w:r>
     </w:p>
     <w:bookmarkEnd w:id="16"/>

</xml_diff>